<commit_message>
refactor: nest all three coursework items under Data Analysis & Programming
Keep the coursework work inside the Data Analysis & Programming section
instead of a sibling group, and treat the Neo4j/PostgreSQL work as
coursework alongside the EV-market multi-agent system and the DQN
prediction-market project. The three now sit as sub-bullets under a
"Coursework projects" lead-in, and the database line is reworded to
describe Neo4j as a graph database.

Co-Authored-By: Claude Opus 5 <noreply@anthropic.com>
Claude-Session: https://claude.ai/code/session_01F8QtaySB59eHrhUhYgFqLs
</commit_message>
<xml_diff>
--- a/CV_Ingyu_Yoo.docx
+++ b/CV_Ingyu_Yoo.docx
@@ -818,52 +818,51 @@
           <w:sz w:val="19"/>
           <w:szCs w:val="19"/>
         </w:rPr>
-        <w:t>Conducted relational data analysis with Neo4j and managed large-scale data using PostgreSQL queries</w:t>
-      </w:r>
-    </w:p>
-    <w:p>
-      <w:pPr>
-        <w:tabs>
-          <w:tab w:val="right" w:pos="10080"/>
-        </w:tabs>
-        <w:spacing w:before="96" w:after="16"/>
-      </w:pPr>
-      <w:r>
-        <w:rPr>
-          <w:b/>
-          <w:bCs/>
-          <w:color w:val="1A1A1A"/>
-          <w:sz w:val="21"/>
-          <w:szCs w:val="21"/>
-        </w:rPr>
-        <w:t>Coursework Projects</w:t>
-      </w:r>
-    </w:p>
-    <w:p>
-      <w:pPr>
-        <w:pStyle w:val="a4"/>
-        <w:numPr>
-          <w:ilvl w:val="0"/>
-          <w:numId w:val="2"/>
-        </w:numPr>
-        <w:spacing w:after="22" w:line="248" w:lineRule="auto"/>
-      </w:pPr>
-      <w:r>
-        <w:rPr>
-          <w:sz w:val="19"/>
-          <w:szCs w:val="19"/>
-        </w:rPr>
-        <w:t>Built a multi-agent system to forecast the electric-vehicle battery market from hypothetical news scenarios</w:t>
-      </w:r>
-    </w:p>
-    <w:p>
-      <w:pPr>
-        <w:pStyle w:val="a4"/>
-        <w:numPr>
-          <w:ilvl w:val="0"/>
-          <w:numId w:val="2"/>
-        </w:numPr>
-        <w:spacing w:after="22" w:line="248" w:lineRule="auto"/>
+        <w:t>Coursework projects — databases, agentic LLM systems, and reinforcement learning</w:t>
+      </w:r>
+    </w:p>
+    <w:p>
+      <w:pPr>
+        <w:pStyle w:val="a4"/>
+        <w:numPr>
+          <w:ilvl w:val="1"/>
+          <w:numId w:val="2"/>
+        </w:numPr>
+        <w:spacing w:after="20" w:line="252" w:lineRule="auto"/>
+      </w:pPr>
+      <w:r>
+        <w:rPr>
+          <w:sz w:val="19"/>
+          <w:szCs w:val="19"/>
+        </w:rPr>
+        <w:t>Analyzed entity relationships with the Neo4j graph database and managed large-scale data through PostgreSQL queries</w:t>
+      </w:r>
+    </w:p>
+    <w:p>
+      <w:pPr>
+        <w:pStyle w:val="a4"/>
+        <w:numPr>
+          <w:ilvl w:val="1"/>
+          <w:numId w:val="2"/>
+        </w:numPr>
+        <w:spacing w:after="20" w:line="252" w:lineRule="auto"/>
+      </w:pPr>
+      <w:r>
+        <w:rPr>
+          <w:sz w:val="19"/>
+          <w:szCs w:val="19"/>
+        </w:rPr>
+        <w:t>Built a multi-agent system that forecasts the electric-vehicle battery market from hypothetical news scenarios</w:t>
+      </w:r>
+    </w:p>
+    <w:p>
+      <w:pPr>
+        <w:pStyle w:val="a4"/>
+        <w:numPr>
+          <w:ilvl w:val="1"/>
+          <w:numId w:val="2"/>
+        </w:numPr>
+        <w:spacing w:after="20" w:line="252" w:lineRule="auto"/>
       </w:pPr>
       <w:r>
         <w:rPr>

</xml_diff>

<commit_message>
feat: add two IMC 2026 co-author posters
Add the ilmenite-hematite thin-film ferrimagnetism poster and the
PINEM chiral-nanoparticle poster to the co-author list, in both
publications.html and the CV (docx + regenerated PDF).

Co-Authored-By: Claude Opus 5 <noreply@anthropic.com>
Claude-Session: https://claude.ai/code/session_01F8QtaySB59eHrhUhYgFqLs
</commit_message>
<xml_diff>
--- a/CV_Ingyu_Yoo.docx
+++ b/CV_Ingyu_Yoo.docx
@@ -1981,6 +1981,100 @@
           <w:szCs w:val="18"/>
         </w:rPr>
         <w:t>AS CO-AUTHOR</w:t>
+      </w:r>
+    </w:p>
+    <w:p>
+      <w:pPr>
+        <w:pStyle w:val="a4"/>
+        <w:numPr>
+          <w:ilvl w:val="0"/>
+          <w:numId w:val="2"/>
+        </w:numPr>
+        <w:spacing w:after="46" w:line="248" w:lineRule="auto"/>
+        <w:jc w:val="both"/>
+      </w:pPr>
+      <w:proofErr w:type="spellStart"/>
+      <w:proofErr w:type="spellEnd"/>
+      <w:proofErr w:type="spellStart"/>
+      <w:proofErr w:type="spellEnd"/>
+      <w:proofErr w:type="spellStart"/>
+      <w:proofErr w:type="spellEnd"/>
+      <w:proofErr w:type="spellStart"/>
+      <w:proofErr w:type="spellEnd"/>
+      <w:proofErr w:type="spellStart"/>
+      <w:proofErr w:type="spellEnd"/>
+      <w:proofErr w:type="spellStart"/>
+      <w:proofErr w:type="spellEnd"/>
+      <w:r>
+        <w:rPr>
+          <w:sz w:val="19"/>
+          <w:szCs w:val="19"/>
+        </w:rPr>
+        <w:t xml:space="preserve">(Poster) Yoonsang Tak, Sehwan Song, Hyeonyu Kim, </w:t>
+      </w:r>
+      <w:r>
+        <w:rPr>
+          <w:b/>
+          <w:bCs/>
+          <w:color w:val="1A1A1A"/>
+          <w:sz w:val="19"/>
+          <w:szCs w:val="19"/>
+        </w:rPr>
+        <w:t>Ingyu Yoo</w:t>
+      </w:r>
+      <w:r>
+        <w:rPr>
+          <w:sz w:val="19"/>
+          <w:szCs w:val="19"/>
+        </w:rPr>
+        <w:t>, Jisung Lee, Sungkyun Park, Dooyong Lee, Miyoung Kim, Sangmoon Yoon, “Atomic-Scale Origin of Thickness-Dependent Ferrimagnetism in Ilmenite–Hematite Thin Films”, The 21th International Microscopy Congress, Liverpool, United Kingdom (2026)</w:t>
+      </w:r>
+    </w:p>
+    <w:p>
+      <w:pPr>
+        <w:pStyle w:val="a4"/>
+        <w:numPr>
+          <w:ilvl w:val="0"/>
+          <w:numId w:val="2"/>
+        </w:numPr>
+        <w:spacing w:after="46" w:line="248" w:lineRule="auto"/>
+        <w:jc w:val="both"/>
+      </w:pPr>
+      <w:proofErr w:type="spellStart"/>
+      <w:proofErr w:type="spellEnd"/>
+      <w:proofErr w:type="spellStart"/>
+      <w:proofErr w:type="spellEnd"/>
+      <w:proofErr w:type="spellStart"/>
+      <w:proofErr w:type="spellEnd"/>
+      <w:proofErr w:type="spellStart"/>
+      <w:proofErr w:type="spellEnd"/>
+      <w:proofErr w:type="spellStart"/>
+      <w:proofErr w:type="spellEnd"/>
+      <w:proofErr w:type="spellStart"/>
+      <w:proofErr w:type="spellEnd"/>
+      <w:r>
+        <w:rPr>
+          <w:sz w:val="19"/>
+          <w:szCs w:val="19"/>
+        </w:rPr>
+        <w:t xml:space="preserve">(Poster) Jaeyeon Jo, Haihua Liu, In Han Ha, </w:t>
+      </w:r>
+      <w:r>
+        <w:rPr>
+          <w:b/>
+          <w:bCs/>
+          <w:color w:val="1A1A1A"/>
+          <w:sz w:val="19"/>
+          <w:szCs w:val="19"/>
+        </w:rPr>
+        <w:t>Ingyu Yoo</w:t>
+      </w:r>
+      <w:r>
+        <w:rPr>
+          <w:sz w:val="19"/>
+          <w:szCs w:val="19"/>
+        </w:rPr>
+        <w:t>, Jian-min Zuo, Ki Tae Nam, Miyoung Kim, “Direct Nanoscale Mapping of Local Optical Chirality in a Single Chiral Nanoparticle via Photon-induced Near-field Electron Microscopy”, The 21th International Microscopy Congress, Liverpool, United Kingdom (2026)</w:t>
       </w:r>
     </w:p>
     <w:p>

</xml_diff>

<commit_message>
fix: mark corresponding authors on IMC 2026 posters and use "21st"
Add the corresponding-author asterisk to Miyoung Kim, Ki Tae Nam, and
Sangmoon Yoon on the two new co-author posters, and correct "The 21th
International Microscopy Congress" to "21st" across all four entries in
publications.html and the CV (docx + regenerated PDF).

Co-Authored-By: Claude Opus 5 <noreply@anthropic.com>
Claude-Session: https://claude.ai/code/session_01F8QtaySB59eHrhUhYgFqLs
</commit_message>
<xml_diff>
--- a/CV_Ingyu_Yoo.docx
+++ b/CV_Ingyu_Yoo.docx
@@ -1546,7 +1546,7 @@
           <w:sz w:val="19"/>
           <w:szCs w:val="19"/>
         </w:rPr>
-        <w:t>Miyoung Kim*, “Interlayer lattice relaxation and moiré structural evolution in TMDs”, The 21th International Microscopy Congress, Liverpool, United Kingdom (2026)</w:t>
+        <w:t>Miyoung Kim*, “Interlayer lattice relaxation and moiré structural evolution in TMDs”, The 21st International Microscopy Congress, Liverpool, United Kingdom (2026)</w:t>
       </w:r>
     </w:p>
     <w:p>
@@ -1964,7 +1964,7 @@
           <w:sz w:val="19"/>
           <w:szCs w:val="19"/>
         </w:rPr>
-        <w:t xml:space="preserve"> MoS2 on a CVD-Grown Bilayer”, The 21th International Microscopy Congress, Liverpool, United Kingdom (2026)</w:t>
+        <w:t xml:space="preserve"> MoS2 on a CVD-Grown Bilayer”, The 21st International Microscopy Congress, Liverpool, United Kingdom (2026)</w:t>
       </w:r>
     </w:p>
     <w:p>
@@ -2027,7 +2027,7 @@
           <w:sz w:val="19"/>
           <w:szCs w:val="19"/>
         </w:rPr>
-        <w:t>, Jisung Lee, Sungkyun Park, Dooyong Lee, Miyoung Kim, Sangmoon Yoon, “Atomic-Scale Origin of Thickness-Dependent Ferrimagnetism in Ilmenite–Hematite Thin Films”, The 21th International Microscopy Congress, Liverpool, United Kingdom (2026)</w:t>
+        <w:t>, Jisung Lee, Sungkyun Park, Dooyong Lee, Miyoung Kim*, Sangmoon Yoon*, “Atomic-Scale Origin of Thickness-Dependent Ferrimagnetism in Ilmenite–Hematite Thin Films”, The 21st International Microscopy Congress, Liverpool, United Kingdom (2026)</w:t>
       </w:r>
     </w:p>
     <w:p>
@@ -2074,7 +2074,7 @@
           <w:sz w:val="19"/>
           <w:szCs w:val="19"/>
         </w:rPr>
-        <w:t>, Jian-min Zuo, Ki Tae Nam, Miyoung Kim, “Direct Nanoscale Mapping of Local Optical Chirality in a Single Chiral Nanoparticle via Photon-induced Near-field Electron Microscopy”, The 21th International Microscopy Congress, Liverpool, United Kingdom (2026)</w:t>
+        <w:t>, Jian-min Zuo, Ki Tae Nam*, Miyoung Kim*, “Direct Nanoscale Mapping of Local Optical Chirality in a Single Chiral Nanoparticle via Photon-induced Near-field Electron Microscopy”, The 21st International Microscopy Congress, Liverpool, United Kingdom (2026)</w:t>
       </w:r>
     </w:p>
     <w:p>

</xml_diff>